<commit_message>
fix: preserve summary report structure and formatting
</commit_message>
<xml_diff>
--- a/src-tauri/resources/summary-report-template.docx
+++ b/src-tauri/resources/summary-report-template.docx
@@ -422,7 +422,7 @@
         <w:rPr>
           <w:rtl w:val="0"/>
         </w:rPr>
-        <w:t xml:space="preserve">БпЛА – {{enemy_uav}} од., з них: знищено – {{enemy_uav_destroyed}} од.; пошкоджено – {{enemy_uav_damaged}} од.;</w:t>
+        <w:t xml:space="preserve">БпЛА – {{enemy_uav}} од., знищено по типам: баражуючий боєприпас – {{enemy_uav_loitering}} од. ({{enemy_uav_molniya}} од. молнія, {{enemy_uav_lancet}} од. ланцет, пошкоджено – {{enemy_uav_damaged}}; пункти управління/укриття – {{enemy_command_posts}}/{{enemy_shelters}}, з них знищено – {{enemy_command_posts_destroyed}} од., пошкоджено – {{enemy_command_posts_damaged}} од. ({{enemy_shelters_damaged}} од. укриття).</w:t>
       </w:r>
     </w:p>
     <w:p>
@@ -488,19 +488,6 @@
           <w:rtl w:val="0"/>
         </w:rPr>
         <w:t xml:space="preserve">Зв’язок/системи зв’язку – {{enemy_communications}} од., з них: знищено – {{enemy_communications_destroyed}} од.; пошкоджено – {{enemy_communications_damaged}} од.;</w:t>
-      </w:r>
-    </w:p>
-    <w:p>
-      <w:pPr>
-        <w:pStyle w:val="Normal.0"/>
-        <w:spacing w:line="240" w:lineRule="auto"/>
-        <w:ind w:firstLine="709"/>
-      </w:pPr>
-      <w:r>
-        <w:rPr>
-          <w:rtl w:val="0"/>
-        </w:rPr>
-        <w:t xml:space="preserve">пункти управління/укриття – {{enemy_command_posts}}/{{enemy_shelters}}, з них знищено – {{enemy_command_posts_destroyed}} од., пошкоджено – {{enemy_command_posts_damaged}} од.</w:t>
       </w:r>
     </w:p>
     <w:p>
@@ -830,7 +817,7 @@
         <w:rPr>
           <w:rtl w:val="0"/>
         </w:rPr>
-        <w:t xml:space="preserve">КСП {{unit_short_name}} – південні околиці населеного пункту {{ksp_locality}}.</w:t>
+        <w:t xml:space="preserve">КСП {{unit_short_name}} – {{ksp_outskirts}} населеного пункту {{ksp_locality}}.</w:t>
       </w:r>
     </w:p>
     <w:p>
@@ -1081,7 +1068,6 @@
           <w:shd w:val="clear" w:color="auto" w:fill="156082"/>
         </w:tblPrEx>
         <w:trPr>
-          <w:trHeight w:val="1278" w:hRule="atLeast"/>
           <w:tblHeader/>
         </w:trPr>
         <w:tc>
@@ -1658,9 +1644,7 @@
         <w:tblPrEx>
           <w:shd w:val="clear" w:color="auto" w:fill="cad1d7"/>
         </w:tblPrEx>
-        <w:trPr>
-          <w:trHeight w:val="402" w:hRule="atLeast"/>
-        </w:trPr>
+        <w:trPr/>
         <w:tc>
           <w:tcPr>
             <w:tcW w:type="dxa" w:w="453"/>
@@ -2157,7 +2141,7 @@
         <w:rPr>
           <w:rtl w:val="0"/>
         </w:rPr>
-        <w:t xml:space="preserve">Розвідка противника та виконання спланованих завдань {{unit_short_name}} {{battalion_short_name}} за період з 18:01 год {{period_start_date}} по 18:00 год {{period_end_date}} здійснювалися {{flight_count}} рази.</w:t>
+        <w:t xml:space="preserve">Розвідка противника та виконання спланованих завдань {{unit_short_name}} {{battalion_short_name}} за період з 18:01 год {{period_start_date}} по 18:00 год {{period_end_date}} {{flight_count}}</w:t>
       </w:r>
     </w:p>
     <w:p>
@@ -3089,11 +3073,17 @@
       </w:pPr>
       <w:r>
         <w:rPr>
-          <w:b w:val="1"/>
-          <w:bCs w:val="1"/>
-          <w:rtl w:val="0"/>
-        </w:rPr>
-        <w:t xml:space="preserve">Тимчасові – {{own_personnel_temporary}}, у тому числі:</w:t>
+          <w:rtl w:val="0"/>
+          <w:b w:val="1"/>
+          <w:bCs w:val="1"/>
+        </w:rPr>
+        <w:t xml:space="preserve">Тимчасові – {{own_personnel_temporary}}</w:t>
+      </w:r>
+      <w:r>
+        <w:rPr>
+          <w:rtl w:val="0"/>
+        </w:rPr>
+        <w:t xml:space="preserve">, у тому числі:</w:t>
       </w:r>
     </w:p>
     <w:p>

</xml_diff>